<commit_message>
Prepare AI governance starter kit paid test
</commit_message>
<xml_diff>
--- a/deliverables/ai-governance-starter-kit-v1/docx/04-ai-update-tracker.docx
+++ b/deliverables/ai-governance-starter-kit-v1/docx/04-ai-update-tracker.docx
@@ -912,6 +912,32 @@
       </w:pPr>
       <w:r>
         <w:t xml:space="preserve">• Retention aligns with sector rules and the longer of: operational need, EU AI Act 10-year (for high-risk), sector-specific retention, or 3 years minimum</w:t>
+      </w:r>
+    </w:p>
+    <w:p>
+      <w:pPr/>
+      <w:r>
+        <w:t xml:space="preserve"/>
+      </w:r>
+    </w:p>
+    <w:p>
+      <w:pPr>
+        <w:pStyle w:val="Heading1"/>
+      </w:pPr>
+      <w:r>
+        <w:t xml:space="preserve">Disclaimer</w:t>
+      </w:r>
+    </w:p>
+    <w:p>
+      <w:pPr/>
+      <w:r>
+        <w:t xml:space="preserve"/>
+      </w:r>
+    </w:p>
+    <w:p>
+      <w:pPr/>
+      <w:r>
+        <w:t xml:space="preserve">This document is a template for educational and informational purposes only. It is not legal advice and does not create an attorney-client relationship. Do not treat it as a compliance guarantee. Consult qualified legal counsel before relying on this template for legal compliance or regulated use cases.</w:t>
       </w:r>
     </w:p>
     <w:sectPr>

</xml_diff>